<commit_message>
Define nicho inicial de eletrônicos e games no Word
</commit_message>
<xml_diff>
--- a/Contexto_Objetivos_Diferencial.docx
+++ b/Contexto_Objetivos_Diferencial.docx
@@ -58,7 +58,21 @@
           <w:color w:val="000000"/>
           <w:sz w:val="21"/>
         </w:rPr>
-        <w:t>Pequenos comércios precisam controlar produtos, pessoas responsáveis e vendas, além de conhecer a tributação que pode incidir sobre cada operação. O sistema é executado no terminal e permite cadastrar funcionários, clientes identificados por CPF e produtos, registrando entradas, saídas, estoque mínimo e alíquotas tributárias por produto.</w:t>
+        <w:t>O sistema será lançado inicialmente para uma loja de eletrônicos e games. Esse nicho reúne consoles, jogos, controles, acessórios, celulares, computadores e periféricos, itens que exigem controle de estoque, registro de vendas e atenção à classificação tributária.</w:t>
+      </w:r>
+    </w:p>
+    <w:p>
+      <w:pPr>
+        <w:spacing w:after="160" w:line="288" w:lineRule="auto"/>
+      </w:pPr>
+      <w:r>
+        <w:rPr>
+          <w:rFonts w:ascii="Arial" w:hAnsi="Arial"/>
+          <w:b w:val="0"/>
+          <w:color w:val="000000"/>
+          <w:sz w:val="21"/>
+        </w:rPr>
+        <w:t>O programa é executado no terminal e permite cadastrar funcionários, clientes identificados por CPF e produtos, registrando entradas, saídas, estoque mínimo e alíquotas tributárias por produto.</w:t>
       </w:r>
     </w:p>
     <w:p>
@@ -147,7 +161,7 @@
           <w:color w:val="000000"/>
           <w:sz w:val="20"/>
         </w:rPr>
-        <w:t>Cadastrar uma alíquota tributária individual para cada produto.</w:t>
+        <w:t>Cadastrar uma alíquota tributária individual para cada produto de eletrônico ou game.</w:t>
       </w:r>
     </w:p>
     <w:p>
@@ -190,7 +204,35 @@
           <w:color w:val="000000"/>
           <w:sz w:val="21"/>
         </w:rPr>
-        <w:t>O diferencial é relacionar o controle de estoque a uma matriz tributária. Em vez de aplicar uma única porcentagem para toda a loja, cada produto recebe uma alíquota cadastrada conforme sua classificação fiscal. Dessa forma, produtos de categorias diferentes podem apresentar estimativas diferentes.</w:t>
+        <w:t>O diferencial é relacionar o controle de estoque de eletrônicos e games a uma matriz tributária. Em vez de aplicar uma única porcentagem para toda a loja, cada produto recebe uma alíquota cadastrada conforme sua classificação fiscal. Dessa forma, um console, um jogo, um celular e um acessório podem apresentar estimativas diferentes.</w:t>
+      </w:r>
+    </w:p>
+    <w:p>
+      <w:pPr>
+        <w:spacing w:before="240" w:after="120"/>
+      </w:pPr>
+      <w:r>
+        <w:rPr>
+          <w:rFonts w:ascii="Arial" w:hAnsi="Arial"/>
+          <w:b/>
+          <w:color w:val="000000"/>
+          <w:sz w:val="28"/>
+        </w:rPr>
+        <w:t>Nicho de Lançamento</w:t>
+      </w:r>
+    </w:p>
+    <w:p>
+      <w:pPr>
+        <w:spacing w:after="160" w:line="288" w:lineRule="auto"/>
+      </w:pPr>
+      <w:r>
+        <w:rPr>
+          <w:rFonts w:ascii="Arial" w:hAnsi="Arial"/>
+          <w:b w:val="0"/>
+          <w:color w:val="000000"/>
+          <w:sz w:val="21"/>
+        </w:rPr>
+        <w:t>O público inicial é uma loja de eletrônicos e games. O foco em um único nicho torna o cadastro mais organizado e permite manter uma tabela fiscal específica para os itens vendidos. Em uma etapa futura, o sistema poderá receber outros nichos, como produtos domésticos, mas eles não fazem parte do escopo inicial.</w:t>
       </w:r>
     </w:p>
     <w:p>
@@ -222,6 +264,11 @@
       </w:r>
     </w:p>
     <w:p>
+      <w:r>
+        <w:br w:type="page"/>
+      </w:r>
+    </w:p>
+    <w:p>
       <w:pPr>
         <w:spacing w:before="240" w:after="120"/>
       </w:pPr>
@@ -232,7 +279,7 @@
           <w:color w:val="000000"/>
           <w:sz w:val="28"/>
         </w:rPr>
-        <w:t>Principais Tributos Relacionados a Produtos e Serviços</w:t>
+        <w:t>Principais Tributos do Nicho de Eletrônicos e Games</w:t>
       </w:r>
     </w:p>
     <w:tbl>
@@ -342,7 +389,7 @@
                 <w:color w:val="000000"/>
                 <w:sz w:val="17"/>
               </w:rPr>
-              <w:t>Circulação de mercadorias; regra estadual e operação.</w:t>
+              <w:t>Venda de mercadorias, como consoles, celulares e acessórios.</w:t>
             </w:r>
           </w:p>
         </w:tc>
@@ -359,7 +406,7 @@
                 <w:color w:val="000000"/>
                 <w:sz w:val="17"/>
               </w:rPr>
-              <w:t>Cadastrada conforme NCM e UF.</w:t>
+              <w:t>Depende de NCM, UF e operação.</w:t>
             </w:r>
           </w:p>
         </w:tc>
@@ -397,7 +444,7 @@
                 <w:color w:val="000000"/>
                 <w:sz w:val="17"/>
               </w:rPr>
-              <w:t>Produtos sujeitos à substituição tributária.</w:t>
+              <w:t>Itens sujeitos à substituição tributária, conforme a UF.</w:t>
             </w:r>
           </w:p>
         </w:tc>
@@ -451,7 +498,7 @@
                 <w:color w:val="000000"/>
                 <w:sz w:val="17"/>
               </w:rPr>
-              <w:t>Produtos industrializados ou importados.</w:t>
+              <w:t>Produtos industrializados ou importados, quando aplicável.</w:t>
             </w:r>
           </w:p>
         </w:tc>
@@ -506,7 +553,7 @@
                 <w:color w:val="000000"/>
                 <w:sz w:val="17"/>
               </w:rPr>
-              <w:t>Receitas; regras variam por regime e produto.</w:t>
+              <w:t>Receitas de venda; regras variam por regime e produto.</w:t>
             </w:r>
           </w:p>
         </w:tc>
@@ -524,7 +571,7 @@
                 <w:color w:val="000000"/>
                 <w:sz w:val="17"/>
               </w:rPr>
-              <w:t>Considerar perfil fiscal do produto.</w:t>
+              <w:t>Considerar perfil fiscal do item.</w:t>
             </w:r>
           </w:p>
         </w:tc>
@@ -543,7 +590,7 @@
                 <w:color w:val="000000"/>
                 <w:sz w:val="17"/>
               </w:rPr>
-              <w:t>ISS</w:t>
+              <w:t>II</w:t>
             </w:r>
           </w:p>
         </w:tc>
@@ -560,7 +607,7 @@
                 <w:color w:val="000000"/>
                 <w:sz w:val="17"/>
               </w:rPr>
-              <w:t>Prestação de serviços, não venda comum de mercadoria.</w:t>
+              <w:t>Console, celular ou periférico importado.</w:t>
             </w:r>
           </w:p>
         </w:tc>
@@ -577,7 +624,7 @@
                 <w:color w:val="000000"/>
                 <w:sz w:val="17"/>
               </w:rPr>
-              <w:t>Depende do município e serviço.</w:t>
+              <w:t>Depende da classificação e origem.</w:t>
             </w:r>
           </w:p>
         </w:tc>
@@ -597,7 +644,7 @@
                 <w:color w:val="000000"/>
                 <w:sz w:val="17"/>
               </w:rPr>
-              <w:t>II</w:t>
+              <w:t>CBS e IBS</w:t>
             </w:r>
           </w:p>
         </w:tc>
@@ -615,7 +662,7 @@
                 <w:color w:val="000000"/>
                 <w:sz w:val="17"/>
               </w:rPr>
-              <w:t>Importação de produtos.</w:t>
+              <w:t>Transição da reforma tributária do consumo.</w:t>
             </w:r>
           </w:p>
         </w:tc>
@@ -633,235 +680,12 @@
                 <w:color w:val="000000"/>
                 <w:sz w:val="17"/>
               </w:rPr>
-              <w:t>Depende da classificação e origem.</w:t>
-            </w:r>
-          </w:p>
-        </w:tc>
-      </w:tr>
-      <w:tr>
-        <w:tc>
-          <w:tcPr>
-            <w:tcW w:type="dxa" w:w="1440"/>
-            <w:vAlign w:val="center"/>
-          </w:tcPr>
-          <w:p>
-            <w:r>
-              <w:rPr>
-                <w:rFonts w:ascii="Arial" w:hAnsi="Arial"/>
-                <w:b w:val="0"/>
-                <w:color w:val="000000"/>
-                <w:sz w:val="17"/>
-              </w:rPr>
-              <w:t>IE</w:t>
-            </w:r>
-          </w:p>
-        </w:tc>
-        <w:tc>
-          <w:tcPr>
-            <w:tcW w:type="dxa" w:w="4752"/>
-            <w:vAlign w:val="center"/>
-          </w:tcPr>
-          <w:p>
-            <w:r>
-              <w:rPr>
-                <w:rFonts w:ascii="Arial" w:hAnsi="Arial"/>
-                <w:b w:val="0"/>
-                <w:color w:val="000000"/>
-                <w:sz w:val="17"/>
-              </w:rPr>
-              <w:t>Exportação, em hipóteses específicas.</w:t>
-            </w:r>
-          </w:p>
-        </w:tc>
-        <w:tc>
-          <w:tcPr>
-            <w:tcW w:type="dxa" w:w="3024"/>
-            <w:vAlign w:val="center"/>
-          </w:tcPr>
-          <w:p>
-            <w:r>
-              <w:rPr>
-                <w:rFonts w:ascii="Arial" w:hAnsi="Arial"/>
-                <w:b w:val="0"/>
-                <w:color w:val="000000"/>
-                <w:sz w:val="17"/>
-              </w:rPr>
-              <w:t>Normalmente exige análise da operação.</w:t>
-            </w:r>
-          </w:p>
-        </w:tc>
-      </w:tr>
-      <w:tr>
-        <w:tc>
-          <w:tcPr>
-            <w:tcW w:type="dxa" w:w="1440"/>
-            <w:vAlign w:val="center"/>
-            <w:shd w:fill="EAF2F8"/>
-          </w:tcPr>
-          <w:p>
-            <w:r>
-              <w:rPr>
-                <w:rFonts w:ascii="Arial" w:hAnsi="Arial"/>
-                <w:b w:val="0"/>
-                <w:color w:val="000000"/>
-                <w:sz w:val="17"/>
-              </w:rPr>
-              <w:t>CIDE Combustíveis</w:t>
-            </w:r>
-          </w:p>
-        </w:tc>
-        <w:tc>
-          <w:tcPr>
-            <w:tcW w:type="dxa" w:w="4752"/>
-            <w:vAlign w:val="center"/>
-            <w:shd w:fill="EAF2F8"/>
-          </w:tcPr>
-          <w:p>
-            <w:r>
-              <w:rPr>
-                <w:rFonts w:ascii="Arial" w:hAnsi="Arial"/>
-                <w:b w:val="0"/>
-                <w:color w:val="000000"/>
-                <w:sz w:val="17"/>
-              </w:rPr>
-              <w:t>Operações com combustíveis.</w:t>
-            </w:r>
-          </w:p>
-        </w:tc>
-        <w:tc>
-          <w:tcPr>
-            <w:tcW w:type="dxa" w:w="3024"/>
-            <w:vAlign w:val="center"/>
-            <w:shd w:fill="EAF2F8"/>
-          </w:tcPr>
-          <w:p>
-            <w:r>
-              <w:rPr>
-                <w:rFonts w:ascii="Arial" w:hAnsi="Arial"/>
-                <w:b w:val="0"/>
-                <w:color w:val="000000"/>
-                <w:sz w:val="17"/>
-              </w:rPr>
-              <w:t>Aplicável somente a essa categoria.</w:t>
-            </w:r>
-          </w:p>
-        </w:tc>
-      </w:tr>
-      <w:tr>
-        <w:tc>
-          <w:tcPr>
-            <w:tcW w:type="dxa" w:w="1440"/>
-            <w:vAlign w:val="center"/>
-          </w:tcPr>
-          <w:p>
-            <w:r>
-              <w:rPr>
-                <w:rFonts w:ascii="Arial" w:hAnsi="Arial"/>
-                <w:b w:val="0"/>
-                <w:color w:val="000000"/>
-                <w:sz w:val="17"/>
-              </w:rPr>
-              <w:t>CBS e IBS</w:t>
-            </w:r>
-          </w:p>
-        </w:tc>
-        <w:tc>
-          <w:tcPr>
-            <w:tcW w:type="dxa" w:w="4752"/>
-            <w:vAlign w:val="center"/>
-          </w:tcPr>
-          <w:p>
-            <w:r>
-              <w:rPr>
-                <w:rFonts w:ascii="Arial" w:hAnsi="Arial"/>
-                <w:b w:val="0"/>
-                <w:color w:val="000000"/>
-                <w:sz w:val="17"/>
-              </w:rPr>
-              <w:t>Transição da reforma tributária do consumo.</w:t>
-            </w:r>
-          </w:p>
-        </w:tc>
-        <w:tc>
-          <w:tcPr>
-            <w:tcW w:type="dxa" w:w="3024"/>
-            <w:vAlign w:val="center"/>
-          </w:tcPr>
-          <w:p>
-            <w:r>
-              <w:rPr>
-                <w:rFonts w:ascii="Arial" w:hAnsi="Arial"/>
-                <w:b w:val="0"/>
-                <w:color w:val="000000"/>
-                <w:sz w:val="17"/>
-              </w:rPr>
-              <w:t>Alíquotas e regras dependem do período e da operação.</w:t>
-            </w:r>
-          </w:p>
-        </w:tc>
-      </w:tr>
-      <w:tr>
-        <w:tc>
-          <w:tcPr>
-            <w:tcW w:type="dxa" w:w="1440"/>
-            <w:vAlign w:val="center"/>
-            <w:shd w:fill="EAF2F8"/>
-          </w:tcPr>
-          <w:p>
-            <w:r>
-              <w:rPr>
-                <w:rFonts w:ascii="Arial" w:hAnsi="Arial"/>
-                <w:b w:val="0"/>
-                <w:color w:val="000000"/>
-                <w:sz w:val="17"/>
-              </w:rPr>
-              <w:t>Imposto Seletivo</w:t>
-            </w:r>
-          </w:p>
-        </w:tc>
-        <w:tc>
-          <w:tcPr>
-            <w:tcW w:type="dxa" w:w="4752"/>
-            <w:vAlign w:val="center"/>
-            <w:shd w:fill="EAF2F8"/>
-          </w:tcPr>
-          <w:p>
-            <w:r>
-              <w:rPr>
-                <w:rFonts w:ascii="Arial" w:hAnsi="Arial"/>
-                <w:b w:val="0"/>
-                <w:color w:val="000000"/>
-                <w:sz w:val="17"/>
-              </w:rPr>
-              <w:t>Produtos prejudiciais à saúde ou ambiente, conforme lei.</w:t>
-            </w:r>
-          </w:p>
-        </w:tc>
-        <w:tc>
-          <w:tcPr>
-            <w:tcW w:type="dxa" w:w="3024"/>
-            <w:vAlign w:val="center"/>
-            <w:shd w:fill="EAF2F8"/>
-          </w:tcPr>
-          <w:p>
-            <w:r>
-              <w:rPr>
-                <w:rFonts w:ascii="Arial" w:hAnsi="Arial"/>
-                <w:b w:val="0"/>
-                <w:color w:val="000000"/>
-                <w:sz w:val="17"/>
-              </w:rPr>
-              <w:t>Produto e regra específicos.</w:t>
+              <w:t>Depende do período e da operação.</w:t>
             </w:r>
           </w:p>
         </w:tc>
       </w:tr>
     </w:tbl>
-    <w:p>
-      <w:r>
-        <w:br w:type="page"/>
-      </w:r>
-    </w:p>
     <w:p>
       <w:pPr>
         <w:spacing w:before="240" w:after="120"/>
@@ -873,7 +697,7 @@
           <w:color w:val="000000"/>
           <w:sz w:val="28"/>
         </w:rPr>
-        <w:t>Perfis de Produtos para Cadastro</w:t>
+        <w:t>Categorias de Produtos para Cadastro</w:t>
       </w:r>
     </w:p>
     <w:tbl>
@@ -966,7 +790,7 @@
                 <w:color w:val="000000"/>
                 <w:sz w:val="17"/>
               </w:rPr>
-              <w:t>Mercadoria geral</w:t>
+              <w:t>Consoles e games</w:t>
             </w:r>
           </w:p>
         </w:tc>
@@ -983,7 +807,7 @@
                 <w:color w:val="000000"/>
                 <w:sz w:val="17"/>
               </w:rPr>
-              <w:t>Roupas, eletrônicos, móveis</w:t>
+              <w:t>Consoles, jogos físicos e controles</w:t>
             </w:r>
           </w:p>
         </w:tc>
@@ -1020,7 +844,7 @@
                 <w:color w:val="000000"/>
                 <w:sz w:val="17"/>
               </w:rPr>
-              <w:t>Alimentos e bebidas</w:t>
+              <w:t>Celulares e tablets</w:t>
             </w:r>
           </w:p>
         </w:tc>
@@ -1038,7 +862,7 @@
                 <w:color w:val="000000"/>
                 <w:sz w:val="17"/>
               </w:rPr>
-              <w:t>Arroz, bebidas, alimentos industrializados</w:t>
+              <w:t>Smartphones, tablets e smartwatches</w:t>
             </w:r>
           </w:p>
         </w:tc>
@@ -1056,7 +880,7 @@
                 <w:color w:val="000000"/>
                 <w:sz w:val="17"/>
               </w:rPr>
-              <w:t>NCM; verificar cesta básica, ICMS ST ou monofásico.</w:t>
+              <w:t>NCM, UF, origem e alíquota.</w:t>
             </w:r>
           </w:p>
         </w:tc>
@@ -1075,7 +899,7 @@
                 <w:color w:val="000000"/>
                 <w:sz w:val="17"/>
               </w:rPr>
-              <w:t>Medicamentos e higiene</w:t>
+              <w:t>Computadores</w:t>
             </w:r>
           </w:p>
         </w:tc>
@@ -1092,7 +916,7 @@
                 <w:color w:val="000000"/>
                 <w:sz w:val="17"/>
               </w:rPr>
-              <w:t>Remédios, cosméticos, higiene</w:t>
+              <w:t>Notebooks, desktops e monitores</w:t>
             </w:r>
           </w:p>
         </w:tc>
@@ -1109,7 +933,7 @@
                 <w:color w:val="000000"/>
                 <w:sz w:val="17"/>
               </w:rPr>
-              <w:t>NCM; verificar regras específicas e benefícios.</w:t>
+              <w:t>NCM, UF, origem e alíquota.</w:t>
             </w:r>
           </w:p>
         </w:tc>
@@ -1129,7 +953,7 @@
                 <w:color w:val="000000"/>
                 <w:sz w:val="17"/>
               </w:rPr>
-              <w:t>Combustíveis</w:t>
+              <w:t>Periféricos</w:t>
             </w:r>
           </w:p>
         </w:tc>
@@ -1147,7 +971,7 @@
                 <w:color w:val="000000"/>
                 <w:sz w:val="17"/>
               </w:rPr>
-              <w:t>Gasolina, diesel, etanol</w:t>
+              <w:t>Teclados, mouses, headsets e webcams</w:t>
             </w:r>
           </w:p>
         </w:tc>
@@ -1165,7 +989,7 @@
                 <w:color w:val="000000"/>
                 <w:sz w:val="17"/>
               </w:rPr>
-              <w:t>NCM e regras monofásicas ou CIDE.</w:t>
+              <w:t>NCM, UF e alíquota.</w:t>
             </w:r>
           </w:p>
         </w:tc>
@@ -1184,7 +1008,7 @@
                 <w:color w:val="000000"/>
                 <w:sz w:val="17"/>
               </w:rPr>
-              <w:t>Importados</w:t>
+              <w:t>Áudio e vídeo</w:t>
             </w:r>
           </w:p>
         </w:tc>
@@ -1201,7 +1025,7 @@
                 <w:color w:val="000000"/>
                 <w:sz w:val="17"/>
               </w:rPr>
-              <w:t>Qualquer item adquirido do exterior</w:t>
+              <w:t>Caixas de som, TVs e câmeras</w:t>
             </w:r>
           </w:p>
         </w:tc>
@@ -1218,7 +1042,7 @@
                 <w:color w:val="000000"/>
                 <w:sz w:val="17"/>
               </w:rPr>
-              <w:t>NCM, origem e II, IPI, ICMS e contribuições.</w:t>
+              <w:t>NCM, UF e alíquota.</w:t>
             </w:r>
           </w:p>
         </w:tc>
@@ -1238,7 +1062,7 @@
                 <w:color w:val="000000"/>
                 <w:sz w:val="17"/>
               </w:rPr>
-              <w:t>Serviços</w:t>
+              <w:t>Acessórios</w:t>
             </w:r>
           </w:p>
         </w:tc>
@@ -1256,7 +1080,7 @@
                 <w:color w:val="000000"/>
                 <w:sz w:val="17"/>
               </w:rPr>
-              <w:t>Frete, manutenção, instalação</w:t>
+              <w:t>Cabos, carregadores e suportes</w:t>
             </w:r>
           </w:p>
         </w:tc>
@@ -1274,7 +1098,7 @@
                 <w:color w:val="000000"/>
                 <w:sz w:val="17"/>
               </w:rPr>
-              <w:t>Código do serviço, município e ISS.</w:t>
+              <w:t>NCM, UF e alíquota.</w:t>
             </w:r>
           </w:p>
         </w:tc>
@@ -1305,7 +1129,7 @@
           <w:color w:val="000000"/>
           <w:sz w:val="21"/>
         </w:rPr>
-        <w:t>Para cada produto, o usuário informa código, nome, categoria, preço, quantidade, estoque mínimo, funcionário responsável e alíquota tributária percentual. O programa calcula: tributo estimado do produto = valor em estoque x alíquota do produto / 100. O relatório soma os tributos estimados de todos os produtos.</w:t>
+        <w:t>Para cada produto do nicho, o usuário informa código, nome, categoria, preço, quantidade, estoque mínimo, funcionário responsável e alíquota tributária percentual. O programa calcula: tributo estimado do produto = valor em estoque x alíquota do produto / 100. O relatório soma os tributos estimados de todos os produtos.</w:t>
       </w:r>
     </w:p>
     <w:p>
@@ -1319,7 +1143,7 @@
           <w:color w:val="000000"/>
           <w:sz w:val="21"/>
         </w:rPr>
-        <w:t>A alíquota deve ser definida após consultar a classificação fiscal e a legislação aplicável. Como exemplo didático, uma mercadoria pode receber 18,00%, enquanto outro item pode receber 0,00%, 7,00% ou outra taxa; esses números não podem ser tratados como regra universal.</w:t>
+        <w:t>A alíquota deve ser definida após consultar NCM, UF e legislação aplicável. Como exemplo didático, um console pode receber uma taxa diferente de um carregador; esses números não podem ser tratados como regra universal para toda a categoria.</w:t>
       </w:r>
     </w:p>
     <w:p>

</xml_diff>

<commit_message>
Adiciona origem nacional ou importada ao documento
</commit_message>
<xml_diff>
--- a/Contexto_Objetivos_Diferencial.docx
+++ b/Contexto_Objetivos_Diferencial.docx
@@ -161,7 +161,7 @@
           <w:color w:val="000000"/>
           <w:sz w:val="20"/>
         </w:rPr>
-        <w:t>Cadastrar uma alíquota tributária individual para cada produto de eletrônico ou game.</w:t>
+        <w:t>Informar se cada produto é nacional ou importado e cadastrar sua alíquota tributária individual.</w:t>
       </w:r>
     </w:p>
     <w:p>
@@ -204,7 +204,7 @@
           <w:color w:val="000000"/>
           <w:sz w:val="21"/>
         </w:rPr>
-        <w:t>O diferencial é relacionar o controle de estoque de eletrônicos e games a uma matriz tributária. Em vez de aplicar uma única porcentagem para toda a loja, cada produto recebe uma alíquota cadastrada conforme sua classificação fiscal. Dessa forma, um console, um jogo, um celular e um acessório podem apresentar estimativas diferentes.</w:t>
+        <w:t>O diferencial é relacionar o controle de estoque de eletrônicos e games a uma matriz tributária. Em vez de aplicar uma única porcentagem para toda a loja, cada produto recebe uma alíquota cadastrada conforme sua classificação fiscal e sua origem, nacional ou importada. Dessa forma, um console, um jogo, um celular e um acessório podem apresentar estimativas diferentes.</w:t>
       </w:r>
     </w:p>
     <w:p>
@@ -261,6 +261,34 @@
           <w:sz w:val="21"/>
         </w:rPr>
         <w:t>Não existe uma alíquota única válida para todos os produtos brasileiros. A apuração real depende, entre outros fatores, do NCM do item, estado de origem e destino, operação, regime tributário, benefícios fiscais, substituição tributária, importação e regras municipais. Por isso, o sistema é uma simulação acadêmica: ele registra a alíquota informada para cada produto e calcula uma estimativa, sem substituir contador, nota fiscal ou sistema fiscal.</w:t>
+      </w:r>
+    </w:p>
+    <w:p>
+      <w:pPr>
+        <w:spacing w:before="240" w:after="120"/>
+      </w:pPr>
+      <w:r>
+        <w:rPr>
+          <w:rFonts w:ascii="Arial" w:hAnsi="Arial"/>
+          <w:b/>
+          <w:color w:val="000000"/>
+          <w:sz w:val="28"/>
+        </w:rPr>
+        <w:t>Origem do Produto</w:t>
+      </w:r>
+    </w:p>
+    <w:p>
+      <w:pPr>
+        <w:spacing w:after="160" w:line="288" w:lineRule="auto"/>
+      </w:pPr>
+      <w:r>
+        <w:rPr>
+          <w:rFonts w:ascii="Arial" w:hAnsi="Arial"/>
+          <w:b w:val="0"/>
+          <w:color w:val="000000"/>
+          <w:sz w:val="21"/>
+        </w:rPr>
+        <w:t>No cadastro, o produto deve ser identificado como nacional ou importado. Essa informação ajuda a diferenciar itens produzidos no Brasil daqueles adquiridos do exterior e orienta a análise de tributos que podem incidir na importação, como o Imposto de Importação. A origem deve ser considerada junto com o NCM, a UF e a operação realizada.</w:t>
       </w:r>
     </w:p>
     <w:p>
@@ -824,7 +852,7 @@
                 <w:color w:val="000000"/>
                 <w:sz w:val="17"/>
               </w:rPr>
-              <w:t>NCM, UF e alíquota informada.</w:t>
+              <w:t>NCM, UF, origem e alíquota.</w:t>
             </w:r>
           </w:p>
         </w:tc>
@@ -989,7 +1017,7 @@
                 <w:color w:val="000000"/>
                 <w:sz w:val="17"/>
               </w:rPr>
-              <w:t>NCM, UF e alíquota.</w:t>
+              <w:t>NCM, UF, origem e alíquota.</w:t>
             </w:r>
           </w:p>
         </w:tc>
@@ -1042,7 +1070,7 @@
                 <w:color w:val="000000"/>
                 <w:sz w:val="17"/>
               </w:rPr>
-              <w:t>NCM, UF e alíquota.</w:t>
+              <w:t>NCM, UF, origem e alíquota.</w:t>
             </w:r>
           </w:p>
         </w:tc>
@@ -1098,7 +1126,7 @@
                 <w:color w:val="000000"/>
                 <w:sz w:val="17"/>
               </w:rPr>
-              <w:t>NCM, UF e alíquota.</w:t>
+              <w:t>NCM, UF, origem e alíquota.</w:t>
             </w:r>
           </w:p>
         </w:tc>
@@ -1129,7 +1157,7 @@
           <w:color w:val="000000"/>
           <w:sz w:val="21"/>
         </w:rPr>
-        <w:t>Para cada produto do nicho, o usuário informa código, nome, categoria, preço, quantidade, estoque mínimo, funcionário responsável e alíquota tributária percentual. O programa calcula: tributo estimado do produto = valor em estoque x alíquota do produto / 100. O relatório soma os tributos estimados de todos os produtos.</w:t>
+        <w:t>Para cada produto do nicho, o usuário informa código, nome, categoria, origem nacional ou importada, preço, quantidade, estoque mínimo, funcionário responsável e alíquota tributária percentual. O programa calcula: tributo estimado do produto = valor em estoque x alíquota do produto / 100. O relatório soma os tributos estimados de todos os produtos.</w:t>
       </w:r>
     </w:p>
     <w:p>
@@ -1143,7 +1171,7 @@
           <w:color w:val="000000"/>
           <w:sz w:val="21"/>
         </w:rPr>
-        <w:t>A alíquota deve ser definida após consultar NCM, UF e legislação aplicável. Como exemplo didático, um console pode receber uma taxa diferente de um carregador; esses números não podem ser tratados como regra universal para toda a categoria.</w:t>
+        <w:t>A alíquota deve ser definida após consultar NCM, origem, UF e legislação aplicável. Como exemplo didático, um console importado pode receber uma análise diferente de um carregador nacional; esses números não podem ser tratados como regra universal para toda a categoria.</w:t>
       </w:r>
     </w:p>
     <w:p>

</xml_diff>